<commit_message>
Relatório v1.5: registra a revisão no controle de versões
- linha 1.5 no controle de versões, com a data da revisão
- Ata 07: pontos discutidos e decisões passam a citar a lista resumida e o
  detalhamento juntos, por repetirem o que o diagrama de casos de uso organiza
</commit_message>
<xml_diff>
--- a/docs/entrega/Projeto-ADS-GestFin-Matheus-Trajano-v1.5.docx
+++ b/docs/entrega/Projeto-ADS-GestFin-Matheus-Trajano-v1.5.docx
@@ -2661,6 +2661,52 @@
           </w:p>
         </w:tc>
       </w:tr>
+      <w:tr>
+        <w:tc>
+          <w:tcPr/>
+          <w:p>
+            <w:pPr>
+              <w:pStyle w:val="Compact"/>
+            </w:pPr>
+            <w:r>
+              <w:t xml:space="preserve">1.5</w:t>
+            </w:r>
+          </w:p>
+        </w:tc>
+        <w:tc>
+          <w:tcPr/>
+          <w:p>
+            <w:pPr>
+              <w:pStyle w:val="Compact"/>
+            </w:pPr>
+            <w:r>
+              <w:t xml:space="preserve">29/09/2026</w:t>
+            </w:r>
+          </w:p>
+        </w:tc>
+        <w:tc>
+          <w:tcPr/>
+          <w:p>
+            <w:pPr>
+              <w:pStyle w:val="Compact"/>
+            </w:pPr>
+            <w:r>
+              <w:t xml:space="preserve">Remoção do detalhamento dos casos de uso, conforme orientação da reunião de 25/09, por repetir o que o diagrama de casos de uso já organiza</w:t>
+            </w:r>
+          </w:p>
+        </w:tc>
+        <w:tc>
+          <w:tcPr/>
+          <w:p>
+            <w:pPr>
+              <w:pStyle w:val="Compact"/>
+            </w:pPr>
+            <w:r>
+              <w:t xml:space="preserve">Matheus Trajano Ferreira Alves</w:t>
+            </w:r>
+          </w:p>
+        </w:tc>
+      </w:tr>
     </w:tbl>
     <w:bookmarkEnd w:id="21"/>
     <w:bookmarkStart w:name="ata-de-reuniões" w:id="22"/>
@@ -3872,7 +3918,7 @@
         <w:t xml:space="preserve">Pontos Discutidos:</w:t>
       </w:r>
       <w:r>
-        <w:t xml:space="preserve"> a lista resumida dos casos de uso repete o que o detalhamento apresenta logo abaixo, e o quadro de relacionamentos do MER repete o que o diagrama já mostra; o dicionário de dados mantém a coluna de obrigatoriedade, mas não identifica a chave primária de cada tabela, que pode ser composta; os diagramas de classes e de sequência estão pequenos demais para leitura, e o número de páginas do documento não é restrição; a apresentação tem quinze minutos e deve seguir a ordem das seções do relatório.</w:t>
+        <w:t xml:space="preserve"> a lista resumida dos casos de uso e o seu detalhamento repetem o que o diagrama de casos de uso já organiza, e o quadro de relacionamentos do MER repete o que o diagrama já mostra; o dicionário de dados mantém a coluna de obrigatoriedade, mas não identifica a chave primária de cada tabela, que pode ser composta; os diagramas de classes e de sequência estão pequenos demais para leitura, e o número de páginas do documento não é restrição; a apresentação tem quinze minutos e deve seguir a ordem das seções do relatório.</w:t>
       </w:r>
     </w:p>
     <w:p xmlns:wp14="http://schemas.microsoft.com/office/word/2010/wordml" wp14:textId="77777777">
@@ -3891,7 +3937,7 @@
         <w:t xml:space="preserve">Decisões:</w:t>
       </w:r>
       <w:r>
-        <w:t xml:space="preserve"> remover a lista resumida dos casos de uso e o quadro de relacionamentos do MER; indicar a chave primária na descrição do campo identificador de cada tabela; ampliar os dois diagramas para uma página inteira cada, com a descrição na página seguinte; apresentar o documento na sequência das seções, encerrando com o sistema em execução e o código.</w:t>
+        <w:t xml:space="preserve"> remover a lista resumida dos casos de uso e o seu detalhamento, além do quadro de relacionamentos do MER; indicar a chave primária na descrição do campo identificador de cada tabela; ampliar os dois diagramas para uma página inteira cada, com a descrição na página seguinte; apresentar o documento na sequência das seções, encerrando com o sistema em execução e o código.</w:t>
       </w:r>
     </w:p>
     <w:p xmlns:wp14="http://schemas.microsoft.com/office/word/2010/wordml" wp14:textId="77777777">

</xml_diff>